<commit_message>
docs: anexo de reproduccion paso a paso en informe ZAP pasivo
Agrega Anexo A con los comandos de bajo impacto (GET/OPTIONS) para repetir
cada hallazgo y los resultados negativos, mas la secuencia para reejecutar
el escaneo pasivo con ZAP (modo protected, sin Active Scan).
</commit_message>
<xml_diff>
--- a/docs/seguridad/Informe_ZAP_Pasivo_ENLYCE_2026-10-12.docx
+++ b/docs/seguridad/Informe_ZAP_Pasivo_ENLYCE_2026-10-12.docx
@@ -4965,7 +4965,7 @@
       <w:pPr>
         <w:spacing w:after="100"/>
       </w:pPr>
-      <w:hyperlink w:history="1" r:id="rIdvczlloaomd1mxzeqb-wah">
+      <w:hyperlink w:history="1" r:id="rIdlr4msjtfpx8lfonryhxyx">
         <w:r>
           <w:rPr>
             <w:rStyle w:val="Hyperlink"/>
@@ -4981,7 +4981,7 @@
       <w:pPr>
         <w:spacing w:after="100"/>
       </w:pPr>
-      <w:hyperlink w:history="1" r:id="rIdnk9zebtmtxvdy_zbjp7t4">
+      <w:hyperlink w:history="1" r:id="rIdu6ddpcjy884nze3pptk8l">
         <w:r>
           <w:rPr>
             <w:rStyle w:val="Hyperlink"/>
@@ -4997,7 +4997,7 @@
       <w:pPr>
         <w:spacing w:after="100"/>
       </w:pPr>
-      <w:hyperlink w:history="1" r:id="rId0w5fhdr16tc8ifeb8desg">
+      <w:hyperlink w:history="1" r:id="rId2vtjwm6jiy2pdo7mofqou">
         <w:r>
           <w:rPr>
             <w:rStyle w:val="Hyperlink"/>
@@ -5013,7 +5013,7 @@
       <w:pPr>
         <w:spacing w:after="100"/>
       </w:pPr>
-      <w:hyperlink w:history="1" r:id="rIdh80loljkeus3ynedjmq3k">
+      <w:hyperlink w:history="1" r:id="rIdeqy11wybfvgfz25mpuvw1">
         <w:r>
           <w:rPr>
             <w:rStyle w:val="Hyperlink"/>
@@ -5029,7 +5029,7 @@
       <w:pPr>
         <w:spacing w:after="100"/>
       </w:pPr>
-      <w:hyperlink w:history="1" r:id="rIdjt9iwssh9ti3wclg9oyti">
+      <w:hyperlink w:history="1" r:id="rIdhfcryozspwieowzbzogyk">
         <w:r>
           <w:rPr>
             <w:rStyle w:val="Hyperlink"/>
@@ -5045,7 +5045,7 @@
       <w:pPr>
         <w:spacing w:after="100"/>
       </w:pPr>
-      <w:hyperlink w:history="1" r:id="rIdfvqlykuuz1equ-4myhjut">
+      <w:hyperlink w:history="1" r:id="rIdnnvorpx1-tuclq3cmoacp">
         <w:r>
           <w:rPr>
             <w:rStyle w:val="Hyperlink"/>
@@ -5061,7 +5061,7 @@
       <w:pPr>
         <w:spacing w:after="100"/>
       </w:pPr>
-      <w:hyperlink w:history="1" r:id="rIdr1_ziskw_aqrpgi-creli">
+      <w:hyperlink w:history="1" r:id="rIdho3azrofbnasm97y5l-l4">
         <w:r>
           <w:rPr>
             <w:rStyle w:val="Hyperlink"/>
@@ -5077,7 +5077,7 @@
       <w:pPr>
         <w:spacing w:after="100"/>
       </w:pPr>
-      <w:hyperlink w:history="1" r:id="rIduyxz-ir9d8aoy8eywjap1">
+      <w:hyperlink w:history="1" r:id="rIdueelmqdzrsra9km_haeax">
         <w:r>
           <w:rPr>
             <w:rStyle w:val="Hyperlink"/>
@@ -5093,7 +5093,7 @@
       <w:pPr>
         <w:spacing w:after="100"/>
       </w:pPr>
-      <w:hyperlink w:history="1" r:id="rIdzx0v_710tmuljluypssqd">
+      <w:hyperlink w:history="1" r:id="rIdgufwe9bkiobpfofcyfpdm">
         <w:r>
           <w:rPr>
             <w:rStyle w:val="Hyperlink"/>
@@ -5126,6 +5126,1128 @@
           <w:szCs w:val="18"/>
         </w:rPr>
         <w:t xml:space="preserve">Fuentes consultadas el 12 de octubre de 2026.</w:t>
+      </w:r>
+    </w:p>
+    <w:p>
+      <w:r>
+        <w:br w:type="page"/>
+      </w:r>
+    </w:p>
+    <w:p>
+      <w:pPr>
+        <w:pStyle w:val="Heading1"/>
+        <w:spacing w:after="130" w:before="260"/>
+      </w:pPr>
+      <w:r>
+        <w:rPr>
+          <w:rFonts w:ascii="Aptos Display" w:cs="Aptos Display" w:eastAsia="Aptos Display" w:hAnsi="Aptos Display"/>
+          <w:b/>
+          <w:bCs/>
+          <w:color w:val="175A8E"/>
+        </w:rPr>
+        <w:t xml:space="preserve">Anexo A. Reproduccion paso a paso</w:t>
+      </w:r>
+    </w:p>
+    <w:p>
+      <w:pPr>
+        <w:spacing w:after="120" w:line="276"/>
+      </w:pPr>
+      <w:r>
+        <w:rPr>
+          <w:rFonts w:ascii="Aptos" w:cs="Aptos" w:eastAsia="Aptos" w:hAnsi="Aptos"/>
+          <w:color w:val="172B4D"/>
+          <w:sz w:val="21"/>
+          <w:szCs w:val="21"/>
+        </w:rPr>
+        <w:t xml:space="preserve">Todos los comandos son de bajo impacto: solo GET (y un OPTIONS para CORS). No modifican estado, no autentican, no envian formularios ni crean registros. Son los mismos que generaron la evidencia de este informe. Reemplaza el valor de User-Agent si tu politica lo exige. En Windows se ejecutan en Git Bash o WSL.</w:t>
+      </w:r>
+    </w:p>
+    <w:p>
+      <w:pPr>
+        <w:spacing w:after="120" w:line="276"/>
+      </w:pPr>
+      <w:r>
+        <w:rPr>
+          <w:rFonts w:ascii="Aptos" w:cs="Aptos" w:eastAsia="Aptos" w:hAnsi="Aptos"/>
+          <w:color w:val="172B4D"/>
+          <w:sz w:val="21"/>
+          <w:szCs w:val="21"/>
+        </w:rPr>
+        <w:t xml:space="preserve">Variable comun usada en los ejemplos:</w:t>
+      </w:r>
+    </w:p>
+    <w:p>
+      <w:pPr>
+        <w:pBdr>
+          <w:top w:val="single" w:color="D5DEE7" w:sz="4"/>
+          <w:bottom w:val="single" w:color="D5DEE7" w:sz="4"/>
+          <w:left w:val="single" w:color="175A8E" w:sz="10"/>
+          <w:right w:val="single" w:color="D5DEE7" w:sz="4"/>
+        </w:pBdr>
+        <w:shd w:fill="F2F4F7" w:val="clear"/>
+        <w:spacing w:after="120" w:before="40" w:line="240"/>
+      </w:pPr>
+      <w:r>
+        <w:rPr>
+          <w:rFonts w:ascii="Consolas" w:cs="Consolas" w:eastAsia="Consolas" w:hAnsi="Consolas"/>
+          <w:color w:val="172B4D"/>
+          <w:sz w:val="17"/>
+          <w:szCs w:val="17"/>
+        </w:rPr>
+        <w:t xml:space="preserve">UA="ENLYCE-AuthorizedSecurityAssessment"</w:t>
+      </w:r>
+      <w:r>
+        <w:rPr>
+          <w:rFonts w:ascii="Consolas" w:cs="Consolas" w:eastAsia="Consolas" w:hAnsi="Consolas"/>
+          <w:color w:val="172B4D"/>
+          <w:sz w:val="17"/>
+          <w:szCs w:val="17"/>
+        </w:rPr>
+        <w:br/>
+        <w:t xml:space="preserve">WEB="https://lyc-web-production.up.railway.app"</w:t>
+      </w:r>
+      <w:r>
+        <w:rPr>
+          <w:rFonts w:ascii="Consolas" w:cs="Consolas" w:eastAsia="Consolas" w:hAnsi="Consolas"/>
+          <w:color w:val="172B4D"/>
+          <w:sz w:val="17"/>
+          <w:szCs w:val="17"/>
+        </w:rPr>
+        <w:br/>
+        <w:t xml:space="preserve">API="https://enlyce-production.up.railway.app"</w:t>
+      </w:r>
+    </w:p>
+    <w:p>
+      <w:pPr>
+        <w:pStyle w:val="Heading2"/>
+        <w:spacing w:after="130" w:before="260"/>
+      </w:pPr>
+      <w:r>
+        <w:rPr>
+          <w:rFonts w:ascii="Aptos Display" w:cs="Aptos Display" w:eastAsia="Aptos Display" w:hAnsi="Aptos Display"/>
+          <w:b/>
+          <w:bCs/>
+          <w:color w:val="172B4D"/>
+        </w:rPr>
+        <w:t xml:space="preserve">A.1. Identificacion de servicios</w:t>
+      </w:r>
+    </w:p>
+    <w:p>
+      <w:pPr>
+        <w:spacing w:after="50" w:before="60"/>
+      </w:pPr>
+      <w:r>
+        <w:rPr>
+          <w:rFonts w:ascii="Aptos" w:cs="Aptos" w:eastAsia="Aptos" w:hAnsi="Aptos"/>
+          <w:b/>
+          <w:bCs/>
+          <w:color w:val="175A8E"/>
+          <w:sz w:val="20"/>
+          <w:szCs w:val="20"/>
+        </w:rPr>
+        <w:t xml:space="preserve">Confirmar cual dominio es la API</w:t>
+      </w:r>
+    </w:p>
+    <w:p>
+      <w:pPr>
+        <w:pBdr>
+          <w:top w:val="single" w:color="D5DEE7" w:sz="4"/>
+          <w:bottom w:val="single" w:color="D5DEE7" w:sz="4"/>
+          <w:left w:val="single" w:color="175A8E" w:sz="10"/>
+          <w:right w:val="single" w:color="D5DEE7" w:sz="4"/>
+        </w:pBdr>
+        <w:shd w:fill="F2F4F7" w:val="clear"/>
+        <w:spacing w:after="120" w:before="40" w:line="240"/>
+      </w:pPr>
+      <w:r>
+        <w:rPr>
+          <w:rFonts w:ascii="Consolas" w:cs="Consolas" w:eastAsia="Consolas" w:hAnsi="Consolas"/>
+          <w:color w:val="52606D"/>
+          <w:sz w:val="17"/>
+          <w:szCs w:val="17"/>
+        </w:rPr>
+        <w:t xml:space="preserve"># La API responde JSON en /health y /api/public/inmuebles; la web no</w:t>
+      </w:r>
+      <w:r>
+        <w:rPr>
+          <w:rFonts w:ascii="Consolas" w:cs="Consolas" w:eastAsia="Consolas" w:hAnsi="Consolas"/>
+          <w:color w:val="172B4D"/>
+          <w:sz w:val="17"/>
+          <w:szCs w:val="17"/>
+        </w:rPr>
+        <w:br/>
+        <w:t xml:space="preserve">curl -sS -A "$UA" "$API/health"</w:t>
+      </w:r>
+      <w:r>
+        <w:rPr>
+          <w:rFonts w:ascii="Consolas" w:cs="Consolas" w:eastAsia="Consolas" w:hAnsi="Consolas"/>
+          <w:color w:val="172B4D"/>
+          <w:sz w:val="17"/>
+          <w:szCs w:val="17"/>
+        </w:rPr>
+        <w:br/>
+        <w:t xml:space="preserve">curl -sS -A "$UA" "$API/api/public/inmuebles"</w:t>
+      </w:r>
+      <w:r>
+        <w:rPr>
+          <w:rFonts w:ascii="Consolas" w:cs="Consolas" w:eastAsia="Consolas" w:hAnsi="Consolas"/>
+          <w:color w:val="172B4D"/>
+          <w:sz w:val="17"/>
+          <w:szCs w:val="17"/>
+        </w:rPr>
+        <w:br/>
+        <w:t xml:space="preserve">curl -sS -A "$UA" -o /dev/null -w "%{http_code}\n" "$WEB/health"</w:t>
+      </w:r>
+    </w:p>
+    <w:p>
+      <w:pPr>
+        <w:spacing w:after="140"/>
+      </w:pPr>
+      <w:r>
+        <w:rPr>
+          <w:rFonts w:ascii="Aptos" w:cs="Aptos" w:eastAsia="Aptos" w:hAnsi="Aptos"/>
+          <w:b/>
+          <w:bCs/>
+          <w:color w:val="176B45"/>
+          <w:sz w:val="19"/>
+          <w:szCs w:val="19"/>
+        </w:rPr>
+        <w:t xml:space="preserve">Resultado esperado: </w:t>
+      </w:r>
+      <w:r>
+        <w:rPr>
+          <w:rFonts w:ascii="Aptos" w:cs="Aptos" w:eastAsia="Aptos" w:hAnsi="Aptos"/>
+          <w:color w:val="172B4D"/>
+          <w:sz w:val="19"/>
+          <w:szCs w:val="19"/>
+        </w:rPr>
+        <w:t xml:space="preserve">$API/health -&gt; {"status":"healthy",...} 200; $WEB/health -&gt; 404. enlyce-production es la API.</w:t>
+      </w:r>
+    </w:p>
+    <w:p>
+      <w:pPr>
+        <w:pStyle w:val="Heading2"/>
+        <w:spacing w:after="130" w:before="260"/>
+      </w:pPr>
+      <w:r>
+        <w:rPr>
+          <w:rFonts w:ascii="Aptos Display" w:cs="Aptos Display" w:eastAsia="Aptos Display" w:hAnsi="Aptos Display"/>
+          <w:b/>
+          <w:bCs/>
+          <w:color w:val="172B4D"/>
+        </w:rPr>
+        <w:t xml:space="preserve">A.2. M-01  CSP con unsafe-inline (web publica)</w:t>
+      </w:r>
+    </w:p>
+    <w:p>
+      <w:pPr>
+        <w:pBdr>
+          <w:top w:val="single" w:color="D5DEE7" w:sz="4"/>
+          <w:bottom w:val="single" w:color="D5DEE7" w:sz="4"/>
+          <w:left w:val="single" w:color="175A8E" w:sz="10"/>
+          <w:right w:val="single" w:color="D5DEE7" w:sz="4"/>
+        </w:pBdr>
+        <w:shd w:fill="F2F4F7" w:val="clear"/>
+        <w:spacing w:after="120" w:before="40" w:line="240"/>
+      </w:pPr>
+      <w:r>
+        <w:rPr>
+          <w:rFonts w:ascii="Consolas" w:cs="Consolas" w:eastAsia="Consolas" w:hAnsi="Consolas"/>
+          <w:color w:val="172B4D"/>
+          <w:sz w:val="17"/>
+          <w:szCs w:val="17"/>
+        </w:rPr>
+        <w:t xml:space="preserve">curl -sS -A "$UA" -D - -o /dev/null "$WEB/" | grep -i "content-security-policy"</w:t>
+      </w:r>
+    </w:p>
+    <w:p>
+      <w:pPr>
+        <w:spacing w:after="140"/>
+      </w:pPr>
+      <w:r>
+        <w:rPr>
+          <w:rFonts w:ascii="Aptos" w:cs="Aptos" w:eastAsia="Aptos" w:hAnsi="Aptos"/>
+          <w:b/>
+          <w:bCs/>
+          <w:color w:val="176B45"/>
+          <w:sz w:val="19"/>
+          <w:szCs w:val="19"/>
+        </w:rPr>
+        <w:t xml:space="preserve">Resultado esperado: </w:t>
+      </w:r>
+      <w:r>
+        <w:rPr>
+          <w:rFonts w:ascii="Aptos" w:cs="Aptos" w:eastAsia="Aptos" w:hAnsi="Aptos"/>
+          <w:color w:val="172B4D"/>
+          <w:sz w:val="19"/>
+          <w:szCs w:val="19"/>
+        </w:rPr>
+        <w:t xml:space="preserve">La cabecera incluye script-src 'self' 'unsafe-inline' y style-src 'self' 'unsafe-inline'. Ver Figura 2.</w:t>
+      </w:r>
+    </w:p>
+    <w:p>
+      <w:pPr>
+        <w:pStyle w:val="Heading2"/>
+        <w:spacing w:after="130" w:before="260"/>
+      </w:pPr>
+      <w:r>
+        <w:rPr>
+          <w:rFonts w:ascii="Aptos Display" w:cs="Aptos Display" w:eastAsia="Aptos Display" w:hAnsi="Aptos Display"/>
+          <w:b/>
+          <w:bCs/>
+          <w:color w:val="172B4D"/>
+        </w:rPr>
+        <w:t xml:space="preserve">A.3. M-02  Subresource Integrity ausente (SPA de la API)</w:t>
+      </w:r>
+    </w:p>
+    <w:p>
+      <w:pPr>
+        <w:pBdr>
+          <w:top w:val="single" w:color="D5DEE7" w:sz="4"/>
+          <w:bottom w:val="single" w:color="D5DEE7" w:sz="4"/>
+          <w:left w:val="single" w:color="175A8E" w:sz="10"/>
+          <w:right w:val="single" w:color="D5DEE7" w:sz="4"/>
+        </w:pBdr>
+        <w:shd w:fill="F2F4F7" w:val="clear"/>
+        <w:spacing w:after="120" w:before="40" w:line="240"/>
+      </w:pPr>
+      <w:r>
+        <w:rPr>
+          <w:rFonts w:ascii="Consolas" w:cs="Consolas" w:eastAsia="Consolas" w:hAnsi="Consolas"/>
+          <w:color w:val="172B4D"/>
+          <w:sz w:val="17"/>
+          <w:szCs w:val="17"/>
+        </w:rPr>
+        <w:t xml:space="preserve">curl -sS -A "$UA" "$API/" | grep -i -E "&lt;link|&lt;script"</w:t>
+      </w:r>
+    </w:p>
+    <w:p>
+      <w:pPr>
+        <w:spacing w:after="140"/>
+      </w:pPr>
+      <w:r>
+        <w:rPr>
+          <w:rFonts w:ascii="Aptos" w:cs="Aptos" w:eastAsia="Aptos" w:hAnsi="Aptos"/>
+          <w:b/>
+          <w:bCs/>
+          <w:color w:val="176B45"/>
+          <w:sz w:val="19"/>
+          <w:szCs w:val="19"/>
+        </w:rPr>
+        <w:t xml:space="preserve">Resultado esperado: </w:t>
+      </w:r>
+      <w:r>
+        <w:rPr>
+          <w:rFonts w:ascii="Aptos" w:cs="Aptos" w:eastAsia="Aptos" w:hAnsi="Aptos"/>
+          <w:color w:val="172B4D"/>
+          <w:sz w:val="19"/>
+          <w:szCs w:val="19"/>
+        </w:rPr>
+        <w:t xml:space="preserve">Las etiquetas link/script externas no tienen atributo integrity=. Ver Figura 3.</w:t>
+      </w:r>
+    </w:p>
+    <w:p>
+      <w:pPr>
+        <w:pStyle w:val="Heading2"/>
+        <w:spacing w:after="130" w:before="260"/>
+      </w:pPr>
+      <w:r>
+        <w:rPr>
+          <w:rFonts w:ascii="Aptos Display" w:cs="Aptos Display" w:eastAsia="Aptos Display" w:hAnsi="Aptos Display"/>
+          <w:b/>
+          <w:bCs/>
+          <w:color w:val="172B4D"/>
+        </w:rPr>
+        <w:t xml:space="preserve">A.4. M-03  CSP de la API sin form-action</w:t>
+      </w:r>
+    </w:p>
+    <w:p>
+      <w:pPr>
+        <w:pBdr>
+          <w:top w:val="single" w:color="D5DEE7" w:sz="4"/>
+          <w:bottom w:val="single" w:color="D5DEE7" w:sz="4"/>
+          <w:left w:val="single" w:color="175A8E" w:sz="10"/>
+          <w:right w:val="single" w:color="D5DEE7" w:sz="4"/>
+        </w:pBdr>
+        <w:shd w:fill="F2F4F7" w:val="clear"/>
+        <w:spacing w:after="120" w:before="40" w:line="240"/>
+      </w:pPr>
+      <w:r>
+        <w:rPr>
+          <w:rFonts w:ascii="Consolas" w:cs="Consolas" w:eastAsia="Consolas" w:hAnsi="Consolas"/>
+          <w:color w:val="172B4D"/>
+          <w:sz w:val="17"/>
+          <w:szCs w:val="17"/>
+        </w:rPr>
+        <w:t xml:space="preserve">curl -sS -A "$UA" -D - -o /dev/null "$API/" | grep -i "content-security-policy"</w:t>
+      </w:r>
+    </w:p>
+    <w:p>
+      <w:pPr>
+        <w:spacing w:after="140"/>
+      </w:pPr>
+      <w:r>
+        <w:rPr>
+          <w:rFonts w:ascii="Aptos" w:cs="Aptos" w:eastAsia="Aptos" w:hAnsi="Aptos"/>
+          <w:b/>
+          <w:bCs/>
+          <w:color w:val="176B45"/>
+          <w:sz w:val="19"/>
+          <w:szCs w:val="19"/>
+        </w:rPr>
+        <w:t xml:space="preserve">Resultado esperado: </w:t>
+      </w:r>
+      <w:r>
+        <w:rPr>
+          <w:rFonts w:ascii="Aptos" w:cs="Aptos" w:eastAsia="Aptos" w:hAnsi="Aptos"/>
+          <w:color w:val="172B4D"/>
+          <w:sz w:val="19"/>
+          <w:szCs w:val="19"/>
+        </w:rPr>
+        <w:t xml:space="preserve">CSP = default-src 'none'; frame-ancestors 'none'; base-uri 'none'. No aparece form-action.</w:t>
+      </w:r>
+    </w:p>
+    <w:p>
+      <w:pPr>
+        <w:pStyle w:val="Heading2"/>
+        <w:spacing w:after="130" w:before="260"/>
+      </w:pPr>
+      <w:r>
+        <w:rPr>
+          <w:rFonts w:ascii="Aptos Display" w:cs="Aptos Display" w:eastAsia="Aptos Display" w:hAnsi="Aptos Display"/>
+          <w:b/>
+          <w:bCs/>
+          <w:color w:val="172B4D"/>
+        </w:rPr>
+        <w:t xml:space="preserve">A.5. L-01  HSTS ausente en la web publica</w:t>
+      </w:r>
+    </w:p>
+    <w:p>
+      <w:pPr>
+        <w:pBdr>
+          <w:top w:val="single" w:color="D5DEE7" w:sz="4"/>
+          <w:bottom w:val="single" w:color="D5DEE7" w:sz="4"/>
+          <w:left w:val="single" w:color="175A8E" w:sz="10"/>
+          <w:right w:val="single" w:color="D5DEE7" w:sz="4"/>
+        </w:pBdr>
+        <w:shd w:fill="F2F4F7" w:val="clear"/>
+        <w:spacing w:after="120" w:before="40" w:line="240"/>
+      </w:pPr>
+      <w:r>
+        <w:rPr>
+          <w:rFonts w:ascii="Consolas" w:cs="Consolas" w:eastAsia="Consolas" w:hAnsi="Consolas"/>
+          <w:color w:val="52606D"/>
+          <w:sz w:val="17"/>
+          <w:szCs w:val="17"/>
+        </w:rPr>
+        <w:t xml:space="preserve"># La web NO envia HSTS (sin salida); la API SI lo envia</w:t>
+      </w:r>
+      <w:r>
+        <w:rPr>
+          <w:rFonts w:ascii="Consolas" w:cs="Consolas" w:eastAsia="Consolas" w:hAnsi="Consolas"/>
+          <w:color w:val="172B4D"/>
+          <w:sz w:val="17"/>
+          <w:szCs w:val="17"/>
+        </w:rPr>
+        <w:br/>
+        <w:t xml:space="preserve">curl -sS -A "$UA" -D - -o /dev/null "$WEB/robots.txt" | grep -i "strict-transport-security" || echo "HSTS AUSENTE en WEB"</w:t>
+      </w:r>
+      <w:r>
+        <w:rPr>
+          <w:rFonts w:ascii="Consolas" w:cs="Consolas" w:eastAsia="Consolas" w:hAnsi="Consolas"/>
+          <w:color w:val="172B4D"/>
+          <w:sz w:val="17"/>
+          <w:szCs w:val="17"/>
+        </w:rPr>
+        <w:br/>
+        <w:t xml:space="preserve">curl -sS -A "$UA" -D - -o /dev/null "$API/health"      | grep -i "strict-transport-security"</w:t>
+      </w:r>
+    </w:p>
+    <w:p>
+      <w:pPr>
+        <w:spacing w:after="140"/>
+      </w:pPr>
+      <w:r>
+        <w:rPr>
+          <w:rFonts w:ascii="Aptos" w:cs="Aptos" w:eastAsia="Aptos" w:hAnsi="Aptos"/>
+          <w:b/>
+          <w:bCs/>
+          <w:color w:val="176B45"/>
+          <w:sz w:val="19"/>
+          <w:szCs w:val="19"/>
+        </w:rPr>
+        <w:t xml:space="preserve">Resultado esperado: </w:t>
+      </w:r>
+      <w:r>
+        <w:rPr>
+          <w:rFonts w:ascii="Aptos" w:cs="Aptos" w:eastAsia="Aptos" w:hAnsi="Aptos"/>
+          <w:color w:val="172B4D"/>
+          <w:sz w:val="19"/>
+          <w:szCs w:val="19"/>
+        </w:rPr>
+        <w:t xml:space="preserve">Primera linea: "HSTS AUSENTE en WEB". Segunda: strict-transport-security: max-age=15552000; includeSubDomains. Ver Figura 4.</w:t>
+      </w:r>
+    </w:p>
+    <w:p>
+      <w:pPr>
+        <w:pStyle w:val="Heading2"/>
+        <w:spacing w:after="130" w:before="260"/>
+      </w:pPr>
+      <w:r>
+        <w:rPr>
+          <w:rFonts w:ascii="Aptos Display" w:cs="Aptos Display" w:eastAsia="Aptos Display" w:hAnsi="Aptos Display"/>
+          <w:b/>
+          <w:bCs/>
+          <w:color w:val="172B4D"/>
+        </w:rPr>
+        <w:t xml:space="preserve">A.6. L-02  Marca de tiempo Unix (verificar falso positivo)</w:t>
+      </w:r>
+    </w:p>
+    <w:p>
+      <w:pPr>
+        <w:pBdr>
+          <w:top w:val="single" w:color="D5DEE7" w:sz="4"/>
+          <w:bottom w:val="single" w:color="D5DEE7" w:sz="4"/>
+          <w:left w:val="single" w:color="175A8E" w:sz="10"/>
+          <w:right w:val="single" w:color="D5DEE7" w:sz="4"/>
+        </w:pBdr>
+        <w:shd w:fill="F2F4F7" w:val="clear"/>
+        <w:spacing w:after="120" w:before="40" w:line="240"/>
+      </w:pPr>
+      <w:r>
+        <w:rPr>
+          <w:rFonts w:ascii="Consolas" w:cs="Consolas" w:eastAsia="Consolas" w:hAnsi="Consolas"/>
+          <w:color w:val="52606D"/>
+          <w:sz w:val="17"/>
+          <w:szCs w:val="17"/>
+        </w:rPr>
+        <w:t xml:space="preserve"># Buscar la constante 2000000000 en el bundle; confirmar que es logica, no una fecha real</w:t>
+      </w:r>
+      <w:r>
+        <w:rPr>
+          <w:rFonts w:ascii="Consolas" w:cs="Consolas" w:eastAsia="Consolas" w:hAnsi="Consolas"/>
+          <w:color w:val="172B4D"/>
+          <w:sz w:val="17"/>
+          <w:szCs w:val="17"/>
+        </w:rPr>
+        <w:br/>
+        <w:t xml:space="preserve">curl -sS -A "$UA" "$WEB/" | grep -oE "2000000000" | head</w:t>
+      </w:r>
+    </w:p>
+    <w:p>
+      <w:pPr>
+        <w:spacing w:after="140"/>
+      </w:pPr>
+      <w:r>
+        <w:rPr>
+          <w:rFonts w:ascii="Aptos" w:cs="Aptos" w:eastAsia="Aptos" w:hAnsi="Aptos"/>
+          <w:b/>
+          <w:bCs/>
+          <w:color w:val="176B45"/>
+          <w:sz w:val="19"/>
+          <w:szCs w:val="19"/>
+        </w:rPr>
+        <w:t xml:space="preserve">Resultado esperado: </w:t>
+      </w:r>
+      <w:r>
+        <w:rPr>
+          <w:rFonts w:ascii="Aptos" w:cs="Aptos" w:eastAsia="Aptos" w:hAnsi="Aptos"/>
+          <w:color w:val="172B4D"/>
+          <w:sz w:val="19"/>
+          <w:szCs w:val="19"/>
+        </w:rPr>
+        <w:t xml:space="preserve">Aparece como constante numerica del JavaScript; no es un timestamp sensible del servidor.</w:t>
+      </w:r>
+    </w:p>
+    <w:p>
+      <w:pPr>
+        <w:pStyle w:val="Heading2"/>
+        <w:spacing w:after="130" w:before="260"/>
+      </w:pPr>
+      <w:r>
+        <w:rPr>
+          <w:rFonts w:ascii="Aptos Display" w:cs="Aptos Display" w:eastAsia="Aptos Display" w:hAnsi="Aptos Display"/>
+          <w:b/>
+          <w:bCs/>
+          <w:color w:val="172B4D"/>
+        </w:rPr>
+        <w:t xml:space="preserve">A.7. I-01  Punto caliente XSS en parametro operation</w:t>
+      </w:r>
+    </w:p>
+    <w:p>
+      <w:pPr>
+        <w:pBdr>
+          <w:top w:val="single" w:color="D5DEE7" w:sz="4"/>
+          <w:bottom w:val="single" w:color="D5DEE7" w:sz="4"/>
+          <w:left w:val="single" w:color="175A8E" w:sz="10"/>
+          <w:right w:val="single" w:color="D5DEE7" w:sz="4"/>
+        </w:pBdr>
+        <w:shd w:fill="F2F4F7" w:val="clear"/>
+        <w:spacing w:after="120" w:before="40" w:line="240"/>
+      </w:pPr>
+      <w:r>
+        <w:rPr>
+          <w:rFonts w:ascii="Consolas" w:cs="Consolas" w:eastAsia="Consolas" w:hAnsi="Consolas"/>
+          <w:color w:val="52606D"/>
+          <w:sz w:val="17"/>
+          <w:szCs w:val="17"/>
+        </w:rPr>
+        <w:t xml:space="preserve"># Solo observacion: pedir la pagina con el parametro y revisar como se refleja en atributos HTML</w:t>
+      </w:r>
+      <w:r>
+        <w:rPr>
+          <w:rFonts w:ascii="Consolas" w:cs="Consolas" w:eastAsia="Consolas" w:hAnsi="Consolas"/>
+          <w:color w:val="172B4D"/>
+          <w:sz w:val="17"/>
+          <w:szCs w:val="17"/>
+        </w:rPr>
+        <w:br/>
+        <w:t xml:space="preserve">curl -sS -A "$UA" "$WEB/inmuebles?operation=Venta" -o /dev/null -w "%{http_code}\n"</w:t>
+      </w:r>
+    </w:p>
+    <w:p>
+      <w:pPr>
+        <w:spacing w:after="140"/>
+      </w:pPr>
+      <w:r>
+        <w:rPr>
+          <w:rFonts w:ascii="Aptos" w:cs="Aptos" w:eastAsia="Aptos" w:hAnsi="Aptos"/>
+          <w:b/>
+          <w:bCs/>
+          <w:color w:val="176B45"/>
+          <w:sz w:val="19"/>
+          <w:szCs w:val="19"/>
+        </w:rPr>
+        <w:t xml:space="preserve">Resultado esperado: </w:t>
+      </w:r>
+      <w:r>
+        <w:rPr>
+          <w:rFonts w:ascii="Aptos" w:cs="Aptos" w:eastAsia="Aptos" w:hAnsi="Aptos"/>
+          <w:color w:val="172B4D"/>
+          <w:sz w:val="19"/>
+          <w:szCs w:val="19"/>
+        </w:rPr>
+        <w:t xml:space="preserve">200. Es un punto para revision manual (codificacion de salida), no una XSS confirmada. No inyectar payloads en produccion.</w:t>
+      </w:r>
+    </w:p>
+    <w:p>
+      <w:pPr>
+        <w:pStyle w:val="Heading2"/>
+        <w:spacing w:after="130" w:before="260"/>
+      </w:pPr>
+      <w:r>
+        <w:rPr>
+          <w:rFonts w:ascii="Aptos Display" w:cs="Aptos Display" w:eastAsia="Aptos Display" w:hAnsi="Aptos Display"/>
+          <w:b/>
+          <w:bCs/>
+          <w:color w:val="172B4D"/>
+        </w:rPr>
+        <w:t xml:space="preserve">A.8. Control de acceso: 401 anonimo (resultado negativo)</w:t>
+      </w:r>
+    </w:p>
+    <w:p>
+      <w:pPr>
+        <w:pBdr>
+          <w:top w:val="single" w:color="D5DEE7" w:sz="4"/>
+          <w:bottom w:val="single" w:color="D5DEE7" w:sz="4"/>
+          <w:left w:val="single" w:color="175A8E" w:sz="10"/>
+          <w:right w:val="single" w:color="D5DEE7" w:sz="4"/>
+        </w:pBdr>
+        <w:shd w:fill="F2F4F7" w:val="clear"/>
+        <w:spacing w:after="120" w:before="40" w:line="240"/>
+      </w:pPr>
+      <w:r>
+        <w:rPr>
+          <w:rFonts w:ascii="Consolas" w:cs="Consolas" w:eastAsia="Consolas" w:hAnsi="Consolas"/>
+          <w:color w:val="172B4D"/>
+          <w:sz w:val="17"/>
+          <w:szCs w:val="17"/>
+        </w:rPr>
+        <w:t xml:space="preserve">for P in /api/auth/me /api/asesores /api/pipeline /api/visitas /api/tareas \</w:t>
+      </w:r>
+      <w:r>
+        <w:rPr>
+          <w:rFonts w:ascii="Consolas" w:cs="Consolas" w:eastAsia="Consolas" w:hAnsi="Consolas"/>
+          <w:color w:val="172B4D"/>
+          <w:sz w:val="17"/>
+          <w:szCs w:val="17"/>
+        </w:rPr>
+        <w:br/>
+        <w:t xml:space="preserve">         /api/alertas /api/contactos /api/demandas /api/publicaciones \</w:t>
+      </w:r>
+      <w:r>
+        <w:rPr>
+          <w:rFonts w:ascii="Consolas" w:cs="Consolas" w:eastAsia="Consolas" w:hAnsi="Consolas"/>
+          <w:color w:val="172B4D"/>
+          <w:sz w:val="17"/>
+          <w:szCs w:val="17"/>
+        </w:rPr>
+        <w:br/>
+        <w:t xml:space="preserve">         /api/analytics/funnel /api/configuracion/sla-leads \</w:t>
+      </w:r>
+      <w:r>
+        <w:rPr>
+          <w:rFonts w:ascii="Consolas" w:cs="Consolas" w:eastAsia="Consolas" w:hAnsi="Consolas"/>
+          <w:color w:val="172B4D"/>
+          <w:sz w:val="17"/>
+          <w:szCs w:val="17"/>
+        </w:rPr>
+        <w:br/>
+        <w:t xml:space="preserve">         /api/opportunities/export.csv /api/billing/pricing; do</w:t>
+      </w:r>
+      <w:r>
+        <w:rPr>
+          <w:rFonts w:ascii="Consolas" w:cs="Consolas" w:eastAsia="Consolas" w:hAnsi="Consolas"/>
+          <w:color w:val="172B4D"/>
+          <w:sz w:val="17"/>
+          <w:szCs w:val="17"/>
+        </w:rPr>
+        <w:br/>
+        <w:t xml:space="preserve">  printf "%-34s " "$P"</w:t>
+      </w:r>
+      <w:r>
+        <w:rPr>
+          <w:rFonts w:ascii="Consolas" w:cs="Consolas" w:eastAsia="Consolas" w:hAnsi="Consolas"/>
+          <w:color w:val="172B4D"/>
+          <w:sz w:val="17"/>
+          <w:szCs w:val="17"/>
+        </w:rPr>
+        <w:br/>
+        <w:t xml:space="preserve">  curl -sS -A "$UA" -o /dev/null -w "%{http_code} / %{size_download}b\n" "$API$P"</w:t>
+      </w:r>
+      <w:r>
+        <w:rPr>
+          <w:rFonts w:ascii="Consolas" w:cs="Consolas" w:eastAsia="Consolas" w:hAnsi="Consolas"/>
+          <w:color w:val="172B4D"/>
+          <w:sz w:val="17"/>
+          <w:szCs w:val="17"/>
+        </w:rPr>
+        <w:br/>
+        <w:t xml:space="preserve">  sleep 0.5</w:t>
+      </w:r>
+      <w:r>
+        <w:rPr>
+          <w:rFonts w:ascii="Consolas" w:cs="Consolas" w:eastAsia="Consolas" w:hAnsi="Consolas"/>
+          <w:color w:val="172B4D"/>
+          <w:sz w:val="17"/>
+          <w:szCs w:val="17"/>
+        </w:rPr>
+        <w:br/>
+        <w:t xml:space="preserve">done</w:t>
+      </w:r>
+    </w:p>
+    <w:p>
+      <w:pPr>
+        <w:spacing w:after="140"/>
+      </w:pPr>
+      <w:r>
+        <w:rPr>
+          <w:rFonts w:ascii="Aptos" w:cs="Aptos" w:eastAsia="Aptos" w:hAnsi="Aptos"/>
+          <w:b/>
+          <w:bCs/>
+          <w:color w:val="176B45"/>
+          <w:sz w:val="19"/>
+          <w:szCs w:val="19"/>
+        </w:rPr>
+        <w:t xml:space="preserve">Resultado esperado: </w:t>
+      </w:r>
+      <w:r>
+        <w:rPr>
+          <w:rFonts w:ascii="Aptos" w:cs="Aptos" w:eastAsia="Aptos" w:hAnsi="Aptos"/>
+          <w:color w:val="172B4D"/>
+          <w:sz w:val="19"/>
+          <w:szCs w:val="19"/>
+        </w:rPr>
+        <w:t xml:space="preserve">Todos responden 401 con 0 bytes (sin fuga de datos ni de errores). Ver Figura 5.</w:t>
+      </w:r>
+    </w:p>
+    <w:p>
+      <w:pPr>
+        <w:pStyle w:val="Heading2"/>
+        <w:spacing w:after="130" w:before="260"/>
+      </w:pPr>
+      <w:r>
+        <w:rPr>
+          <w:rFonts w:ascii="Aptos Display" w:cs="Aptos Display" w:eastAsia="Aptos Display" w:hAnsi="Aptos Display"/>
+          <w:b/>
+          <w:bCs/>
+          <w:color w:val="172B4D"/>
+        </w:rPr>
+        <w:t xml:space="preserve">A.9. CORS: origen hostil rechazado (resultado negativo)</w:t>
+      </w:r>
+    </w:p>
+    <w:p>
+      <w:pPr>
+        <w:pBdr>
+          <w:top w:val="single" w:color="D5DEE7" w:sz="4"/>
+          <w:bottom w:val="single" w:color="D5DEE7" w:sz="4"/>
+          <w:left w:val="single" w:color="175A8E" w:sz="10"/>
+          <w:right w:val="single" w:color="D5DEE7" w:sz="4"/>
+        </w:pBdr>
+        <w:shd w:fill="F2F4F7" w:val="clear"/>
+        <w:spacing w:after="120" w:before="40" w:line="240"/>
+      </w:pPr>
+      <w:r>
+        <w:rPr>
+          <w:rFonts w:ascii="Consolas" w:cs="Consolas" w:eastAsia="Consolas" w:hAnsi="Consolas"/>
+          <w:color w:val="172B4D"/>
+          <w:sz w:val="17"/>
+          <w:szCs w:val="17"/>
+        </w:rPr>
+        <w:t xml:space="preserve">curl -sS -A "$UA" -X OPTIONS -D - -o /dev/null \</w:t>
+      </w:r>
+      <w:r>
+        <w:rPr>
+          <w:rFonts w:ascii="Consolas" w:cs="Consolas" w:eastAsia="Consolas" w:hAnsi="Consolas"/>
+          <w:color w:val="172B4D"/>
+          <w:sz w:val="17"/>
+          <w:szCs w:val="17"/>
+        </w:rPr>
+        <w:br/>
+        <w:t xml:space="preserve">  -H "Origin: https://evil.example" \</w:t>
+      </w:r>
+      <w:r>
+        <w:rPr>
+          <w:rFonts w:ascii="Consolas" w:cs="Consolas" w:eastAsia="Consolas" w:hAnsi="Consolas"/>
+          <w:color w:val="172B4D"/>
+          <w:sz w:val="17"/>
+          <w:szCs w:val="17"/>
+        </w:rPr>
+        <w:br/>
+        <w:t xml:space="preserve">  -H "Access-Control-Request-Method: GET" \</w:t>
+      </w:r>
+      <w:r>
+        <w:rPr>
+          <w:rFonts w:ascii="Consolas" w:cs="Consolas" w:eastAsia="Consolas" w:hAnsi="Consolas"/>
+          <w:color w:val="172B4D"/>
+          <w:sz w:val="17"/>
+          <w:szCs w:val="17"/>
+        </w:rPr>
+        <w:br/>
+        <w:t xml:space="preserve">  "$API/api/public/inmuebles"</w:t>
+      </w:r>
+    </w:p>
+    <w:p>
+      <w:pPr>
+        <w:spacing w:after="140"/>
+      </w:pPr>
+      <w:r>
+        <w:rPr>
+          <w:rFonts w:ascii="Aptos" w:cs="Aptos" w:eastAsia="Aptos" w:hAnsi="Aptos"/>
+          <w:b/>
+          <w:bCs/>
+          <w:color w:val="176B45"/>
+          <w:sz w:val="19"/>
+          <w:szCs w:val="19"/>
+        </w:rPr>
+        <w:t xml:space="preserve">Resultado esperado: </w:t>
+      </w:r>
+      <w:r>
+        <w:rPr>
+          <w:rFonts w:ascii="Aptos" w:cs="Aptos" w:eastAsia="Aptos" w:hAnsi="Aptos"/>
+          <w:color w:val="172B4D"/>
+          <w:sz w:val="19"/>
+          <w:szCs w:val="19"/>
+        </w:rPr>
+        <w:t xml:space="preserve">204 sin cabecera Access-Control-Allow-Origin: la API no refleja origenes arbitrarios. Ver Figura 6.</w:t>
+      </w:r>
+    </w:p>
+    <w:p>
+      <w:pPr>
+        <w:pStyle w:val="Heading2"/>
+        <w:spacing w:after="130" w:before="260"/>
+      </w:pPr>
+      <w:r>
+        <w:rPr>
+          <w:rFonts w:ascii="Aptos Display" w:cs="Aptos Display" w:eastAsia="Aptos Display" w:hAnsi="Aptos Display"/>
+          <w:b/>
+          <w:bCs/>
+          <w:color w:val="172B4D"/>
+        </w:rPr>
+        <w:t xml:space="preserve">A.10. Reejecutar el escaneo pasivo completo con ZAP</w:t>
+      </w:r>
+    </w:p>
+    <w:p>
+      <w:pPr>
+        <w:spacing w:after="120" w:line="276"/>
+      </w:pPr>
+      <w:r>
+        <w:rPr>
+          <w:rFonts w:ascii="Aptos" w:cs="Aptos" w:eastAsia="Aptos" w:hAnsi="Aptos"/>
+          <w:color w:val="172B4D"/>
+          <w:sz w:val="21"/>
+          <w:szCs w:val="21"/>
+        </w:rPr>
+        <w:t xml:space="preserve">Para reproducir el analisis pasivo que consolido el conteo de alertas (modo protected, sin Active Scan):</w:t>
+      </w:r>
+    </w:p>
+    <w:p>
+      <w:pPr>
+        <w:pBdr>
+          <w:top w:val="single" w:color="D5DEE7" w:sz="4"/>
+          <w:bottom w:val="single" w:color="D5DEE7" w:sz="4"/>
+          <w:left w:val="single" w:color="175A8E" w:sz="10"/>
+          <w:right w:val="single" w:color="D5DEE7" w:sz="4"/>
+        </w:pBdr>
+        <w:shd w:fill="F2F4F7" w:val="clear"/>
+        <w:spacing w:after="120" w:before="40" w:line="240"/>
+      </w:pPr>
+      <w:r>
+        <w:rPr>
+          <w:rFonts w:ascii="Consolas" w:cs="Consolas" w:eastAsia="Consolas" w:hAnsi="Consolas"/>
+          <w:color w:val="52606D"/>
+          <w:sz w:val="17"/>
+          <w:szCs w:val="17"/>
+        </w:rPr>
+        <w:t xml:space="preserve"># 1) Arrancar ZAP en daemon (ajusta la ruta del jar y una API key propia)</w:t>
+      </w:r>
+      <w:r>
+        <w:rPr>
+          <w:rFonts w:ascii="Consolas" w:cs="Consolas" w:eastAsia="Consolas" w:hAnsi="Consolas"/>
+          <w:color w:val="172B4D"/>
+          <w:sz w:val="17"/>
+          <w:szCs w:val="17"/>
+        </w:rPr>
+        <w:br/>
+        <w:t xml:space="preserve">KEY="una-clave-propia"</w:t>
+      </w:r>
+      <w:r>
+        <w:rPr>
+          <w:rFonts w:ascii="Consolas" w:cs="Consolas" w:eastAsia="Consolas" w:hAnsi="Consolas"/>
+          <w:color w:val="172B4D"/>
+          <w:sz w:val="17"/>
+          <w:szCs w:val="17"/>
+        </w:rPr>
+        <w:br/>
+        <w:t xml:space="preserve">java -jar "zap-2.17.0.jar" -daemon -host 127.0.0.1 -port 8099 \</w:t>
+      </w:r>
+      <w:r>
+        <w:rPr>
+          <w:rFonts w:ascii="Consolas" w:cs="Consolas" w:eastAsia="Consolas" w:hAnsi="Consolas"/>
+          <w:color w:val="172B4D"/>
+          <w:sz w:val="17"/>
+          <w:szCs w:val="17"/>
+        </w:rPr>
+        <w:br/>
+        <w:t xml:space="preserve">  -config api.key=$KEY</w:t>
+      </w:r>
+      <w:r>
+        <w:rPr>
+          <w:rFonts w:ascii="Consolas" w:cs="Consolas" w:eastAsia="Consolas" w:hAnsi="Consolas"/>
+          <w:color w:val="172B4D"/>
+          <w:sz w:val="17"/>
+          <w:szCs w:val="17"/>
+        </w:rPr>
+        <w:br/>
+        <w:t xml:space="preserve"/>
+      </w:r>
+      <w:r>
+        <w:rPr>
+          <w:rFonts w:ascii="Consolas" w:cs="Consolas" w:eastAsia="Consolas" w:hAnsi="Consolas"/>
+          <w:color w:val="52606D"/>
+          <w:sz w:val="17"/>
+          <w:szCs w:val="17"/>
+        </w:rPr>
+        <w:br/>
+        <w:t xml:space="preserve"># 2) Modo protected + contexto limitado a los dos origenes</w:t>
+      </w:r>
+      <w:r>
+        <w:rPr>
+          <w:rFonts w:ascii="Consolas" w:cs="Consolas" w:eastAsia="Consolas" w:hAnsi="Consolas"/>
+          <w:color w:val="172B4D"/>
+          <w:sz w:val="17"/>
+          <w:szCs w:val="17"/>
+        </w:rPr>
+        <w:br/>
+        <w:t xml:space="preserve">B="http://127.0.0.1:8099"</w:t>
+      </w:r>
+      <w:r>
+        <w:rPr>
+          <w:rFonts w:ascii="Consolas" w:cs="Consolas" w:eastAsia="Consolas" w:hAnsi="Consolas"/>
+          <w:color w:val="172B4D"/>
+          <w:sz w:val="17"/>
+          <w:szCs w:val="17"/>
+        </w:rPr>
+        <w:br/>
+        <w:t xml:space="preserve">curl -s "$B/JSON/core/action/setMode/?mode=protect&amp;apikey=$KEY"</w:t>
+      </w:r>
+      <w:r>
+        <w:rPr>
+          <w:rFonts w:ascii="Consolas" w:cs="Consolas" w:eastAsia="Consolas" w:hAnsi="Consolas"/>
+          <w:color w:val="172B4D"/>
+          <w:sz w:val="17"/>
+          <w:szCs w:val="17"/>
+        </w:rPr>
+        <w:br/>
+        <w:t xml:space="preserve">curl -s "$B/JSON/context/action/newContext/?contextName=enlyce-scope&amp;apikey=$KEY"</w:t>
+      </w:r>
+      <w:r>
+        <w:rPr>
+          <w:rFonts w:ascii="Consolas" w:cs="Consolas" w:eastAsia="Consolas" w:hAnsi="Consolas"/>
+          <w:color w:val="172B4D"/>
+          <w:sz w:val="17"/>
+          <w:szCs w:val="17"/>
+        </w:rPr>
+        <w:br/>
+        <w:t xml:space="preserve">curl -s "$B/JSON/context/action/includeInContext/?contextName=enlyce-scope&amp;regex=https://lyc-web-production\.up\.railway\.app.*&amp;apikey=$KEY"</w:t>
+      </w:r>
+      <w:r>
+        <w:rPr>
+          <w:rFonts w:ascii="Consolas" w:cs="Consolas" w:eastAsia="Consolas" w:hAnsi="Consolas"/>
+          <w:color w:val="172B4D"/>
+          <w:sz w:val="17"/>
+          <w:szCs w:val="17"/>
+        </w:rPr>
+        <w:br/>
+        <w:t xml:space="preserve">curl -s "$B/JSON/context/action/includeInContext/?contextName=enlyce-scope&amp;regex=https://enlyce-production\.up\.railway\.app.*&amp;apikey=$KEY"</w:t>
+      </w:r>
+      <w:r>
+        <w:rPr>
+          <w:rFonts w:ascii="Consolas" w:cs="Consolas" w:eastAsia="Consolas" w:hAnsi="Consolas"/>
+          <w:color w:val="172B4D"/>
+          <w:sz w:val="17"/>
+          <w:szCs w:val="17"/>
+        </w:rPr>
+        <w:br/>
+        <w:t xml:space="preserve"/>
+      </w:r>
+      <w:r>
+        <w:rPr>
+          <w:rFonts w:ascii="Consolas" w:cs="Consolas" w:eastAsia="Consolas" w:hAnsi="Consolas"/>
+          <w:color w:val="52606D"/>
+          <w:sz w:val="17"/>
+          <w:szCs w:val="17"/>
+        </w:rPr>
+        <w:br/>
+        <w:t xml:space="preserve"># 3) Spider controlado (1 hilo, ritmo limitado) sobre cada origen</w:t>
+      </w:r>
+      <w:r>
+        <w:rPr>
+          <w:rFonts w:ascii="Consolas" w:cs="Consolas" w:eastAsia="Consolas" w:hAnsi="Consolas"/>
+          <w:color w:val="172B4D"/>
+          <w:sz w:val="17"/>
+          <w:szCs w:val="17"/>
+        </w:rPr>
+        <w:br/>
+        <w:t xml:space="preserve">curl -s "$B/JSON/spider/action/setOptionThreadCount/?Integer=1&amp;apikey=$KEY"</w:t>
+      </w:r>
+      <w:r>
+        <w:rPr>
+          <w:rFonts w:ascii="Consolas" w:cs="Consolas" w:eastAsia="Consolas" w:hAnsi="Consolas"/>
+          <w:color w:val="172B4D"/>
+          <w:sz w:val="17"/>
+          <w:szCs w:val="17"/>
+        </w:rPr>
+        <w:br/>
+        <w:t xml:space="preserve">curl -s "$B/JSON/spider/action/scan/?url=$WEB/&amp;contextName=enlyce-scope&amp;subtreeOnly=true&amp;apikey=$KEY"</w:t>
+      </w:r>
+      <w:r>
+        <w:rPr>
+          <w:rFonts w:ascii="Consolas" w:cs="Consolas" w:eastAsia="Consolas" w:hAnsi="Consolas"/>
+          <w:color w:val="172B4D"/>
+          <w:sz w:val="17"/>
+          <w:szCs w:val="17"/>
+        </w:rPr>
+        <w:br/>
+        <w:t xml:space="preserve">curl -s "$B/JSON/spider/action/scan/?url=$API/&amp;contextName=enlyce-scope&amp;subtreeOnly=true&amp;apikey=$KEY"</w:t>
+      </w:r>
+      <w:r>
+        <w:rPr>
+          <w:rFonts w:ascii="Consolas" w:cs="Consolas" w:eastAsia="Consolas" w:hAnsi="Consolas"/>
+          <w:color w:val="172B4D"/>
+          <w:sz w:val="17"/>
+          <w:szCs w:val="17"/>
+        </w:rPr>
+        <w:br/>
+        <w:t xml:space="preserve"/>
+      </w:r>
+      <w:r>
+        <w:rPr>
+          <w:rFonts w:ascii="Consolas" w:cs="Consolas" w:eastAsia="Consolas" w:hAnsi="Consolas"/>
+          <w:color w:val="52606D"/>
+          <w:sz w:val="17"/>
+          <w:szCs w:val="17"/>
+        </w:rPr>
+        <w:br/>
+        <w:t xml:space="preserve"># 4) (NO ejecutar Active Scan). Esperar la cola pasiva y leer alertas + reporte</w:t>
+      </w:r>
+      <w:r>
+        <w:rPr>
+          <w:rFonts w:ascii="Consolas" w:cs="Consolas" w:eastAsia="Consolas" w:hAnsi="Consolas"/>
+          <w:color w:val="172B4D"/>
+          <w:sz w:val="17"/>
+          <w:szCs w:val="17"/>
+        </w:rPr>
+        <w:br/>
+        <w:t xml:space="preserve">curl -s "$B/JSON/pscan/view/recordsToScan/?apikey=$KEY"</w:t>
+      </w:r>
+      <w:r>
+        <w:rPr>
+          <w:rFonts w:ascii="Consolas" w:cs="Consolas" w:eastAsia="Consolas" w:hAnsi="Consolas"/>
+          <w:color w:val="172B4D"/>
+          <w:sz w:val="17"/>
+          <w:szCs w:val="17"/>
+        </w:rPr>
+        <w:br/>
+        <w:t xml:space="preserve">curl -s "$B/JSON/alert/view/alertsSummary/?apikey=$KEY"</w:t>
+      </w:r>
+      <w:r>
+        <w:rPr>
+          <w:rFonts w:ascii="Consolas" w:cs="Consolas" w:eastAsia="Consolas" w:hAnsi="Consolas"/>
+          <w:color w:val="172B4D"/>
+          <w:sz w:val="17"/>
+          <w:szCs w:val="17"/>
+        </w:rPr>
+        <w:br/>
+        <w:t xml:space="preserve">curl -s "$B/JSON/reports/action/generate/?template=modern&amp;reportFileName=enlyce-zap-report.html&amp;reportDir=&lt;carpeta&gt;&amp;apikey=$KEY"</w:t>
+      </w:r>
+    </w:p>
+    <w:p>
+      <w:pPr>
+        <w:spacing w:after="140"/>
+      </w:pPr>
+      <w:r>
+        <w:rPr>
+          <w:rFonts w:ascii="Aptos" w:cs="Aptos" w:eastAsia="Aptos" w:hAnsi="Aptos"/>
+          <w:b/>
+          <w:bCs/>
+          <w:color w:val="176B45"/>
+          <w:sz w:val="19"/>
+          <w:szCs w:val="19"/>
+        </w:rPr>
+        <w:t xml:space="preserve">Resultado esperado: </w:t>
+      </w:r>
+      <w:r>
+        <w:rPr>
+          <w:rFonts w:ascii="Aptos" w:cs="Aptos" w:eastAsia="Aptos" w:hAnsi="Aptos"/>
+          <w:color w:val="172B4D"/>
+          <w:sz w:val="19"/>
+          <w:szCs w:val="19"/>
+        </w:rPr>
+        <w:t xml:space="preserve">alertsSummary con 0 High. El reporte HTML (enlyce-zap-report.html) reproduce la Figura 1. Las instancias por URL pueden variar levemente segun la cobertura del spider.</w:t>
+      </w:r>
+    </w:p>
+    <w:p>
+      <w:pPr>
+        <w:spacing w:after="120" w:line="276"/>
+        <w:rPr>
+          <w:i/>
+          <w:iCs/>
+          <w:color w:val="52606D"/>
+          <w:sz w:val="19"/>
+          <w:szCs w:val="19"/>
+        </w:rPr>
+      </w:pPr>
+      <w:r>
+        <w:rPr>
+          <w:rFonts w:ascii="Aptos" w:cs="Aptos" w:eastAsia="Aptos" w:hAnsi="Aptos"/>
+          <w:i/>
+          <w:iCs/>
+          <w:color w:val="52606D"/>
+          <w:sz w:val="19"/>
+          <w:szCs w:val="19"/>
+        </w:rPr>
+        <w:t xml:space="preserve">Nota de seguridad: mantener el alcance en los dos dominios propios, limitar la tasa y detenerse ante errores o lentitud. No ejecutar Active Scan, fuzzing ni fuerza bruta sobre produccion sin autorizacion explicita para ese tipo de prueba.</w:t>
       </w:r>
     </w:p>
     <w:sectPr>

</xml_diff>